<commit_message>
Step 4: JUnit 5 tests, JaCoCo coverage, CI mvn test
Add root pom.xml with JUnit 5 and JaCoCo; tests for AccessorSelector,
StyleManager, and Presentation. Exclude test tree from main compile.
Run mvn test in DTAP D/T/P gates. Ignore Maven target/. Update
implementation step log (Step 4 + Step 3 list note).

Made-with: Cursor
</commit_message>
<xml_diff>
--- a/IMPLEMENTATION-STEP-LOG..docx
+++ b/IMPLEMENTATION-STEP-LOG..docx
@@ -183,6 +183,51 @@
       </w:pPr>
     </w:p>
     <w:p>
+      <w:r>
+        <w:t>Step 4 – Unit tests and coverage (completed)</w:t>
+      </w:r>
+    </w:p>
+    <w:p>
+      <w:r>
+        <w:t>What we did</w:t>
+      </w:r>
+    </w:p>
+    <w:p>
+      <w:r>
+        <w:t>Introduced JUnit 5 unit tests and JaCoCo coverage, wired into GitHub Actions so the Development gate runs `mvn test` on feature/develop (and T/A/P pipelines use the same check).</w:t>
+      </w:r>
+    </w:p>
+    <w:p>
+      <w:r>
+        <w:t>How we did it</w:t>
+      </w:r>
+    </w:p>
+    <w:p>
+      <w:r>
+        <w:t>Root `pom.xml` (Maven, Java 17): `Jabberpoint-IT/src/` remains production code; tests in `Jabberpoint-IT/src/test/java/`. The compiler plugin excludes `**/test/**` from the main source compile.</w:t>
+      </w:r>
+    </w:p>
+    <w:p>
+      <w:r>
+        <w:t>New tests: `AccessorSelectorTest` (Strategy returns non-null `Accessor`, same XML instance); `StyleManagerTest` (Singleton identity, `getStyle` for levels 0–4 and clamping for high levels); `PresentationTest` (slides, invalid indices, next/prev bounds, Observer `setTitle` notification, duplicate listener ignored).</w:t>
+      </w:r>
+    </w:p>
+    <w:p>
+      <w:r>
+        <w:t>Run locally: `mvn test`. Coverage report: `target/site/jacoco/index.html` after tests. CI: `.github/workflows/dtap-ci-cd.yml` compile steps replaced with `mvn -B test`. `target/` added to `.gitignore`.</w:t>
+      </w:r>
+    </w:p>
+    <w:p>
+      <w:r>
+        <w:t>Why</w:t>
+      </w:r>
+    </w:p>
+    <w:p>
+      <w:r>
+        <w:t>Automated tests lock in behaviour for the patterns we added (Observer, Singleton, Strategy) without launching Swing. Coverage supports rubric discussion; CI enforces the suite on every push.</w:t>
+      </w:r>
+    </w:p>
+    <w:p>
       <w:pPr>
         <w:pStyle w:val="Heading1"/>
       </w:pPr>
@@ -205,16 +250,14 @@
         <w:pStyle w:val="ListBullet"/>
       </w:pPr>
       <w:r>
-        <w:t>Step 3 – Strategy: AccessorSelector and file-type strategies (XML; JSON/TXT as follow-up).</w:t>
+        <w:t>Step 3 – Strategy: AccessorSelector (completed); JSON/TXT remain optional follow-up.</w:t>
       </w:r>
     </w:p>
     <w:p>
       <w:pPr>
         <w:pStyle w:val="ListBullet"/>
       </w:pPr>
-      <w:r>
-        <w:t>Step 4 – Unit tests and coverage toward rubric targets.</w:t>
-      </w:r>
+      <w:r/>
     </w:p>
     <w:p>
       <w:pPr>

</xml_diff>

<commit_message>
Rubric wrap-up: deployable JAR, docs, SOLID, DTAP CI fallback
- pom: maven-jar-plugin Main-Class JabberPoint for runnable JAR
- CI: mvn test when pom.xml present, else javac (D/T/P gates)
- Release tarball includes pom.xml and root README
- Class diagram + ASTAH spec: StyleManager, Observer, AccessorSelector
- SOLID-PRINCIPLES.md; expanded READMEs; BRANCH-PROTECTION CI note
- Implementation log: Step 5 complete, optional follow-ups, CI sentence fix

Made-with: Cursor
</commit_message>
<xml_diff>
--- a/IMPLEMENTATION-STEP-LOG..docx
+++ b/IMPLEMENTATION-STEP-LOG..docx
@@ -214,7 +214,7 @@
     </w:p>
     <w:p>
       <w:r>
-        <w:t>Run locally: `mvn test`. Coverage report: `target/site/jacoco/index.html` after tests. CI: `.github/workflows/dtap-ci-cd.yml` compile steps replaced with `mvn -B test`. `target/` added to `.gitignore`.</w:t>
+        <w:t>Run locally: `mvn test`. Coverage report: `target/site/jacoco/index.html` after tests. CI: `.github/workflows/dtap-ci-cd.yml` runs `mvn -B test` when `pom.xml` exists, else `javac`. `target/` in `.gitignore`.</w:t>
       </w:r>
     </w:p>
     <w:p>
@@ -228,11 +228,61 @@
       </w:r>
     </w:p>
     <w:p>
+      <w:r>
+        <w:t>Step 5 – SOLID documentation (completed)</w:t>
+      </w:r>
+    </w:p>
+    <w:p>
+      <w:r>
+        <w:t>What we did</w:t>
+      </w:r>
+    </w:p>
+    <w:p>
+      <w:r>
+        <w:t>Documented how the refactored design relates to SOLID for rubrics and reviews, without changing application behaviour.</w:t>
+      </w:r>
+    </w:p>
+    <w:p>
+      <w:r>
+        <w:t>How we did it</w:t>
+      </w:r>
+    </w:p>
+    <w:p>
+      <w:r>
+        <w:t>Added `Jabberpoint-IT/docs/SOLID-PRINCIPLES.md` with a table mapping each SOLID letter to concrete classes (e.g. DIP via `SlideChangeListener` / `Accessor`, OCP via `AccessorSelector` and new `Accessor` types, SRP split across persistence, model, and view).</w:t>
+      </w:r>
+    </w:p>
+    <w:p>
+      <w:r>
+        <w:t>Expanded `Jabberpoint-IT/README.md` and root `README.md` with build (`mvn test`, `mvn package`), run instructions (cwd for `test.xml`), links to DTAP/CI and diagrams.</w:t>
+      </w:r>
+    </w:p>
+    <w:p>
+      <w:r>
+        <w:t>Updated `Jabberpoint-IT/docs/Jabberpoint-ClassDiagram.puml` to match the code: `StyleManager` + value-object `Style`, Observer API on `Presentation`, Strategy via `AccessorSelector` without direct `JabberPoint` → `XMLAccessor` dependency in the diagram.</w:t>
+      </w:r>
+    </w:p>
+    <w:p>
+      <w:r>
+        <w:t>CI workflow: D/T/P gates run `mvn test` when `pom.xml` exists, else `javac`, so DTAP stays green on strategy-only branches. `pom.xml` includes `maven-jar-plugin` with `Main-Class: JabberPoint` for a deployable desktop JAR.</w:t>
+      </w:r>
+    </w:p>
+    <w:p>
+      <w:r>
+        <w:t>Why</w:t>
+      </w:r>
+    </w:p>
+    <w:p>
+      <w:r>
+        <w:t>Rubric alignment: explicit SOLID narrative, up-to-date diagrams, reproducible build and hand-off (JAR + README), and CI that matches the documented DTAP story.</w:t>
+      </w:r>
+    </w:p>
+    <w:p>
       <w:pPr>
         <w:pStyle w:val="Heading1"/>
       </w:pPr>
       <w:r>
-        <w:t>Next steps (remaining)</w:t>
+        <w:t>Optional follow-ups (not required for rubric steps 1–5)</w:t>
       </w:r>
     </w:p>
     <w:p>
@@ -263,9 +313,7 @@
       <w:pPr>
         <w:pStyle w:val="ListBullet"/>
       </w:pPr>
-      <w:r>
-        <w:t>Step 5 – SOLID documentation in code/comments where each principle applies.</w:t>
-      </w:r>
+      <w:r/>
     </w:p>
     <w:sectPr>
       <w:pgSz w:w="12240" w:h="15840"/>

</xml_diff>

<commit_message>
docs: add full Step 3 Strategy section to implementation log
Document AccessorSelector, JabberPoint and MenuController changes,
what/how/why; clarify optional follow-up as second file format only.

Made-with: Cursor
</commit_message>
<xml_diff>
--- a/IMPLEMENTATION-STEP-LOG..docx
+++ b/IMPLEMENTATION-STEP-LOG..docx
@@ -184,6 +184,56 @@
     </w:p>
     <w:p>
       <w:r>
+        <w:t>Step 3 – Strategy pattern (completed)</w:t>
+      </w:r>
+    </w:p>
+    <w:p>
+      <w:r>
+        <w:t>What we did</w:t>
+      </w:r>
+    </w:p>
+    <w:p>
+      <w:r>
+        <w:t>We applied the Strategy pattern to presentation persistence: the application depends on the abstract `Accessor` type, not on `XMLAccessor` directly. Each concrete `Accessor` implements how to load and save a `Presentation`; the UI and main class no longer hard-code the XML class.</w:t>
+      </w:r>
+    </w:p>
+    <w:p>
+      <w:r>
+        <w:t>How we did it</w:t>
+      </w:r>
+    </w:p>
+    <w:p>
+      <w:r>
+        <w:t>Added `AccessorSelector` in `Jabberpoint-IT/src/AccessorSelector.java` with `forFilename(String)` returning an `Accessor`. It provides a single place to choose the persistence strategy; today it returns the XML strategy (`XMLAccessor`); the method is structured so another format can be added later (e.g. branch on file extension).</w:t>
+      </w:r>
+    </w:p>
+    <w:p>
+      <w:r>
+        <w:t>Updated `Jabberpoint-IT/src/JabberPoint.java`: when a file path is passed on the command line, loading uses `AccessorSelector.forFilename(argv[0]).loadFile(presentation, argv[0])` instead of `new XMLAccessor()`.</w:t>
+      </w:r>
+    </w:p>
+    <w:p>
+      <w:r>
+        <w:t>Updated `Jabberpoint-IT/src/MenuController.java`: File → Open and File → Save use `Accessor accessor = AccessorSelector.forFilename(...)` then `accessor.loadFile` / `accessor.saveFile` instead of `new XMLAccessor()` in the menu actions.</w:t>
+      </w:r>
+    </w:p>
+    <w:p>
+      <w:r>
+        <w:t>Kept `Accessor` as the Strategy interface and `XMLAccessor` / `DemoPresentation` as concrete strategies; demo mode still uses `Accessor.getDemoAccessor()` for the built-in demo presentation.</w:t>
+      </w:r>
+    </w:p>
+    <w:p>
+      <w:r>
+        <w:t>Why</w:t>
+      </w:r>
+    </w:p>
+    <w:p>
+      <w:r>
+        <w:t>Strategy lets us swap or add persistence algorithms without changing `MenuController` or `JabberPoint` for each format. It matches the course rubric (named pattern, clear role) and supports Open/Closed extension (new `Accessor` subclass + selector logic) instead of scattering `new XMLAccessor()` across the codebase. Work was developed on branch `feature/strategy` before merging toward `develop`.</w:t>
+      </w:r>
+    </w:p>
+    <w:p>
+      <w:r>
         <w:t>Step 4 – Unit tests and coverage (completed)</w:t>
       </w:r>
     </w:p>
@@ -300,7 +350,7 @@
         <w:pStyle w:val="ListBullet"/>
       </w:pPr>
       <w:r>
-        <w:t>Step 3 – Strategy: AccessorSelector (completed); JSON/TXT remain optional follow-up.</w:t>
+        <w:t>Optional extension: second persistence format (e.g. JSON) as a new `Accessor` plus a branch in `AccessorSelector` (not required for the core assignment).</w:t>
       </w:r>
     </w:p>
     <w:p>

</xml_diff>